<commit_message>
Phase 151f: the online identity check switched from Veriff to Didit, still off; Lakhbir's answers recorded
- src/connectors/identity-check.ts: Didit's session call; a result believed only when X-Signature-V2 or
  X-Signature holds and X-Timestamp is within five minutes; under-way statuses not kept; unknown is never PASS.
- migration 053: identity_checks.provider may be DIDIT (VERIFF kept); Didit's names for a person refused in our copy.
- test/phase151f.test.ts, and the identity-check sections of phase151 and phase151b in Didit's shapes.
- The guide, Help, the Developer Spec, the privacy notice draft and the clause 7 comment name Didit.
- Word question 170 answered (yes, five conditions) and closed; Phase 151g written to enforce them.
- The eight Director items are Lakhbir's again and the tracker refuses that owner type.

Co-Authored-By: Claude Opus 5.5 <noreply@anthropic.com>
</commit_message>
<xml_diff>
--- a/Caprebate/06-commercial-and-governance/Caprebate Engagement Letter.docx
+++ b/Caprebate/06-commercial-and-governance/Caprebate Engagement Letter.docx
@@ -231,17 +231,17 @@
     </w:p>
     <w:p>
       <w:r>
-        <w:t xml:space="preserve">“One of these organisations is Veriff OÜ, a company in Estonia, which runs the online identity check we use to confirm who we are dealing with. If we ask a person to complete a check, we send Veriff only their first and last name and our reference for the check. The person then photographs their identity document and takes a selfie on their own phone, and these go to Veriff, not to us. Veriff tells us the result. We keep the result, the type of document checked and the country that issued it. We do not keep the photographs or the document number. Veriff holds this data in the European Union.”</w:t>
-      </w:r>
-    </w:p>
-    <w:p>
-      <w:r>
-        <w:t xml:space="preserve">Why: Lakhbir chose Veriff on 24 September 2026 (Word question 225). We check every client’s identity, whether or not the money-laundering rules require us to be supervised (Word question 10; the accountant is still to confirm the supervision point). The identity check is built and switched off. It will not send anything until Veriff is named in this clause and in the privacy notice.</w:t>
-      </w:r>
-    </w:p>
-    <w:p>
-      <w:r>
-        <w:t xml:space="preserve">Before this goes in: (1) the solicitor approves or changes the wording; (2) the data protection officer approves the matching entry drafted for the privacy notice on 25 September 2026; (3) we have written terms with Veriff that meet Article 28 of the UK GDPR [for the solicitor to confirm]; (4) the officer confirms the lawful basis for the check, and how the selfie, which is used to match a face, is treated.</w:t>
+        <w:t xml:space="preserve">“One of these organisations is Didit [its company name and country, for the solicitor to confirm from Didit’s terms], which runs the online identity check we use to confirm who we are dealing with. If we ask a person to complete a check, we send Didit only their first and last name and our reference for the check. The person then photographs their identity document and takes a selfie on their own phone, and these go to Didit, not to us. Didit tells us the result. We keep the result, the type of document checked and the country that issued it. We do not keep the photographs or the document number. Didit processes and stores this data in the European Union.”</w:t>
+      </w:r>
+    </w:p>
+    <w:p>
+      <w:r>
+        <w:t xml:space="preserve">Why: Lakhbir chose Veriff on 24 September 2026 (Word question 225) and switched to Didit on 25 September 2026. We check every client’s identity, whether or not the money-laundering rules require us to be supervised (Word question 10; the accountant is still to confirm the supervision point). The identity check is built and switched off. It will not send anything until Didit is named in this clause and in the privacy notice.</w:t>
+      </w:r>
+    </w:p>
+    <w:p>
+      <w:r>
+        <w:t xml:space="preserve">Before this goes in: (1) the solicitor approves or changes the wording; (2) the data protection officer approves the matching entry drafted for the privacy notice on 25 September 2026; (3) we have written terms with Didit that meet Article 28 of the UK GDPR [for the solicitor to confirm]; (4) the officer confirms the lawful basis for the check, and how the selfie, which is used to match a face, is treated.</w:t>
       </w:r>
     </w:p>
   </w:comment>

</xml_diff>

<commit_message>
Phase 153: five decisions carried into about fifty documents (the mailbox live and read, monday.com dropped, the Claude API, the title register by hand, BCIS); the privacy notice link built hidden at the address question on the site and in the back end; the thank-you screens' live address; the engagement letter's specimen no longer a real company; the review pack re-derived at 53; BCIS location factors tested (D30-D34); Word question 5 closed, 238 asked, fifteen duplicates linked; SDP-P40 in, SDP-L4 out; Phase 153a written; claim cleared
Co-Authored-By: Claude Opus 5.5 <noreply@anthropic.com>
</commit_message>
<xml_diff>
--- a/Caprebate/06-commercial-and-governance/Caprebate Engagement Letter.docx
+++ b/Caprebate/06-commercial-and-governance/Caprebate Engagement Letter.docx
@@ -231,7 +231,7 @@
     </w:p>
     <w:p>
       <w:r>
-        <w:t xml:space="preserve">“One of these organisations is Didit [its company name and country, for the solicitor to confirm from Didit’s terms], which runs the online identity check we use to confirm who we are dealing with. If we ask a person to complete a check, we send Didit only their first and last name and our reference for the check. The person then photographs their identity document and takes a selfie on their own phone, and these go to Didit, not to us. Didit tells us the result. We keep the result, the type of document checked and the country that issued it. We do not keep the photographs or the document number. Didit processes and stores this data in the European Union.”</w:t>
+        <w:t xml:space="preserve">“One of these organisations is Didit [proposed: Didit Identity Spain, S.L., a company in Spain, as named in Didit’s own terms (didit.me/terms/business, read 25 September 2026) and in the privacy notice draft of that day — for the solicitor to confirm], which runs the online identity check we use to confirm who we are dealing with. If we ask a person to complete a check, we send Didit only their first and last name and our reference for the check. The person then photographs their identity document and takes a selfie on their own phone, and these go to Didit, not to us. Didit tells us the result. We keep the result, the type of document checked and the country that issued it. We do not keep the photographs or the document number. Didit processes and stores this data in the European Union.”</w:t>
       </w:r>
     </w:p>
     <w:p>
@@ -241,7 +241,7 @@
     </w:p>
     <w:p>
       <w:r>
-        <w:t xml:space="preserve">Before this goes in: (1) the solicitor approves or changes the wording; (2) the data protection officer approves the matching entry drafted for the privacy notice on 25 September 2026; (3) we have written terms with Didit that meet Article 28 of the UK GDPR [for the solicitor to confirm]; (4) the officer confirms the lawful basis for the check, and how the selfie, which is used to match a face, is treated.</w:t>
+        <w:t xml:space="preserve">Before this goes in: (1) the solicitor approves or changes the wording; (2) the data protection officer approves the matching entry drafted for the privacy notice on 25 September 2026; (3) we have written terms with Didit that meet Article 28 of the UK GDPR [proposed: Didit’s Data Processing Addendum, Annex 2 of its business terms, which becomes part of our contract with Didit Identity Spain, S.L. once we accept those terms (read 25 September 2026, recorded in the privacy notice draft) — for the solicitor to confirm]; (4) the officer confirms the lawful basis for the check, and how the selfie, which is used to match a face, is treated.</w:t>
       </w:r>
     </w:p>
   </w:comment>
@@ -349,14 +349,14 @@
           <w:rFonts w:cstheme="minorHAnsi"/>
           <w:color w:val="000000" w:themeColor="text1"/>
         </w:rPr>
-        <w:t xml:space="preserve"> Oakfield Care Group</w:t>
-      </w:r>
-      <w:r>
-        <w:rPr>
-          <w:rFonts w:cstheme="minorHAnsi"/>
-          <w:color w:val="000000" w:themeColor="text1"/>
-        </w:rPr>
-        <w:t>, a company registered in England and Wales under company number 09183422 (“you”, “the Client”)</w:t>
+        <w:t xml:space="preserve"> Quenmoor Care Group</w:t>
+      </w:r>
+      <w:r>
+        <w:rPr>
+          <w:rFonts w:cstheme="minorHAnsi"/>
+          <w:color w:val="000000" w:themeColor="text1"/>
+        </w:rPr>
+        <w:t>, a company registered in England and Wales under company number 98604417 (“you”, “the Client”)</w:t>
       </w:r>
     </w:p>
     <w:p>
@@ -409,7 +409,7 @@
           <w:rFonts w:cstheme="minorHAnsi"/>
           <w:color w:val="000000" w:themeColor="text1"/>
         </w:rPr>
-        <w:t xml:space="preserve">This letter (“the Agreement”), together with the accompanying Terms of Business (if any are issued separately), sets out the entire agreement between Cap Rebate and Oakfield Care Group Ltd for the identification and quantification of capital allowances available on the Property. Once countersigned by an </w:t>
+        <w:t xml:space="preserve">This letter (“the Agreement”), together with the accompanying Terms of Business (if any are issued separately), sets out the entire agreement between Cap Rebate and Quenmoor Care Group Ltd for the identification and quantification of capital allowances available on the Property. Once countersigned by an </w:t>
       </w:r>
       <w:proofErr w:type="spellStart"/>
       <w:r>
@@ -1617,7 +1617,7 @@
           <w:bCs/>
           <w:color w:val="000000" w:themeColor="text1"/>
         </w:rPr>
-        <w:t>Signed for and on behalf of Oakfield Care Group Ltd</w:t>
+        <w:t>Signed for and on behalf of Quenmoor Care Group Ltd</w:t>
       </w:r>
     </w:p>
     <w:p>
@@ -1633,7 +1633,7 @@
           <w:rFonts w:cstheme="minorHAnsi"/>
           <w:color w:val="000000" w:themeColor="text1"/>
         </w:rPr>
-        <w:t>Oakfield Care Group Ltd (Company No. 09183422)</w:t>
+        <w:t>Quenmoor Care Group Ltd (Company No. 98604417)</w:t>
       </w:r>
     </w:p>
     <w:p>

</xml_diff>